<commit_message>
feat(monetization): lead marketplace, credit purchases, ROI dashboard, earnings statement, quality analytics
Complete monetization suite for WorkersArena:

- Worker ROI dashboard (/dashboard/roi) with monthly funnel, KPIs, and 6-month trend
- Credit purchase flow: engine + server action + API route + OMT/Whish confirm + UI at /dashboard/credits
- Lead quality rating (§12): star ratings on purchased leads, pricing multipliers, matching weight adjustments
- Lead quality analytics (/admin/analytics/lead-quality): weekly trends, per-grade stats, price multiplier impact
- Worker earnings statement (/dashboard/earnings): monthly breakdown of GMV, fees, rebates, net payouts
- Prisma models: LeadRating, LeadRebate, WorkerCreditEntry, PlatformFeeSnapshot
- 6 migrations, 68 new tests (1,344 total), typecheck clean, lint 0 errors

🤖 Generated with Codebuff
Co-Authored-By: Codebuff <noreply@codebuff.com>
</commit_message>
<xml_diff>
--- a/docs/WorkersArena-User-Manual.docx
+++ b/docs/WorkersArena-User-Manual.docx
@@ -61,7 +61,7 @@
           <w:sz w:val="18"/>
           <w:szCs w:val="18"/>
         </w:rPr>
-        <w:t xml:space="preserve">Generated 2026-08-18 — regenerated by `npm run docs:manual` (runs in the standard check `npm run test:all`), so this document always matches the shipped application.</w:t>
+        <w:t xml:space="preserve">Generated 2026-09-14 — regenerated by `npm run docs:manual` (runs in the standard check `npm run test:all`), so this document always matches the shipped application.</w:t>
       </w:r>
     </w:p>
     <w:p>
@@ -1035,7 +1035,7 @@
           <w:sz w:val="22"/>
           <w:szCs w:val="22"/>
         </w:rPr>
-        <w:t xml:space="preserve">Pick the city and area from the dropdowns (cities like Beirut, Riyadh, Dubai are seeded with their areas).</w:t>
+        <w:t xml:space="preserve">Pick the city and area from the dropdowns (the seeded cities — e.g. Beirut — each carry their areas).</w:t>
       </w:r>
     </w:p>
     <w:p>
@@ -5972,6 +5972,408 @@
           <w:szCs w:val="22"/>
         </w:rPr>
         <w:t xml:space="preserve">If the network drops, failed navigations show the bilingual offline page with a Try again button instead of a browser error.</w:t>
+      </w:r>
+    </w:p>
+    <w:p>
+      <w:pPr>
+        <w:pStyle w:val="Heading2"/>
+        <w:spacing w:before="260" w:after="100"/>
+      </w:pPr>
+      <w:r>
+        <w:rPr>
+          <w:b/>
+          <w:bCs/>
+          <w:color w:val="0E7490"/>
+          <w:sz w:val="28"/>
+          <w:szCs w:val="28"/>
+        </w:rPr>
+        <w:t xml:space="preserve">3.17 Lead marketplace (qualified leads)</w:t>
+      </w:r>
+    </w:p>
+    <w:p>
+      <w:pPr>
+        <w:spacing w:after="120" w:line="300"/>
+      </w:pPr>
+      <w:r>
+        <w:rPr>
+          <w:color w:val="0F172A"/>
+          <w:sz w:val="22"/>
+          <w:szCs w:val="22"/>
+        </w:rPr>
+        <w:t xml:space="preserve">The platform also sells the match the customer never made: a posted request is graded by how qualified it is and offered to only a few best-matched professionals, who can pay platform credits to unlock the customer's contact details and quote the job directly. The customer experience is unchanged.</w:t>
+      </w:r>
+    </w:p>
+    <w:p>
+      <w:pPr>
+        <w:shd w:fill="E0F2FE" w:val="clear"/>
+        <w:spacing w:after="100" w:line="290"/>
+      </w:pPr>
+      <w:r>
+        <w:rPr>
+          <w:b/>
+          <w:bCs/>
+          <w:color w:val="0E7490"/>
+          <w:sz w:val="22"/>
+          <w:szCs w:val="22"/>
+        </w:rPr>
+        <w:t xml:space="preserve">Roles involved: </w:t>
+      </w:r>
+      <w:r>
+        <w:rPr>
+          <w:color w:val="0F172A"/>
+          <w:sz w:val="22"/>
+          <w:szCs w:val="22"/>
+        </w:rPr>
+      </w:r>
+    </w:p>
+    <w:p>
+      <w:pPr>
+        <w:pStyle w:val="Heading3"/>
+        <w:spacing w:before="200" w:after="80"/>
+      </w:pPr>
+      <w:r>
+        <w:rPr>
+          <w:b/>
+          <w:bCs/>
+          <w:color w:val="0F172A"/>
+          <w:sz w:val="24"/>
+          <w:szCs w:val="24"/>
+        </w:rPr>
+        <w:t xml:space="preserve">Functionality</w:t>
+      </w:r>
+    </w:p>
+    <w:p>
+      <w:pPr>
+        <w:pStyle w:val="ListParagraph"/>
+        <w:numPr>
+          <w:ilvl w:val="0"/>
+          <w:numId w:val="1"/>
+        </w:numPr>
+        <w:spacing w:after="60" w:line="290"/>
+      </w:pPr>
+      <w:r>
+        <w:rPr>
+          <w:color w:val="0F172A"/>
+          <w:sz w:val="22"/>
+          <w:szCs w:val="22"/>
+        </w:rPr>
+        <w:t xml:space="preserve">Grading: every request is scored and bucketed BRONZE (a trade and little else), SILVER (service, area, real detail), GOLD (verified customer, priced service, long description, photos) or EMERGENCY (24/7 urgent — wins outright).</w:t>
+      </w:r>
+    </w:p>
+    <w:p>
+      <w:pPr>
+        <w:pStyle w:val="ListParagraph"/>
+        <w:numPr>
+          <w:ilvl w:val="0"/>
+          <w:numId w:val="1"/>
+        </w:numPr>
+        <w:spacing w:after="60" w:line="290"/>
+      </w:pPr>
+      <w:r>
+        <w:rPr>
+          <w:color w:val="0F172A"/>
+          <w:sz w:val="22"/>
+          <w:szCs w:val="22"/>
+        </w:rPr>
+        <w:t xml:space="preserve">Matching: weighted signals (trade 30, area/city 20, rating 12, response rate 10, availability 8, review volume 6, plan tier 6, emergency 5, verified 3) rank the pool; only the configured number of workers (3 by default) ever see the request. A different trade, an inactive worker, or a non-emergency worker on an emergency lead is filtered out.</w:t>
+      </w:r>
+    </w:p>
+    <w:p>
+      <w:pPr>
+        <w:pStyle w:val="ListParagraph"/>
+        <w:numPr>
+          <w:ilvl w:val="0"/>
+          <w:numId w:val="1"/>
+        </w:numPr>
+        <w:spacing w:after="60" w:line="290"/>
+      </w:pPr>
+      <w:r>
+        <w:rPr>
+          <w:color w:val="0F172A"/>
+          <w:sz w:val="22"/>
+          <w:szCs w:val="22"/>
+        </w:rPr>
+        <w:t xml:space="preserve">Paid, exclusive, expiring leads: each offer carries a locked credit price (defaults 5 / 9 / 20 / 35 credits for bronze → emergency). Buying it debits the platform credit ledger once, withdraws the competing offers when the lead is exclusive, and expires after the configured window (2 hours by default).</w:t>
+      </w:r>
+    </w:p>
+    <w:p>
+      <w:pPr>
+        <w:pStyle w:val="ListParagraph"/>
+        <w:numPr>
+          <w:ilvl w:val="0"/>
+          <w:numId w:val="1"/>
+        </w:numPr>
+        <w:spacing w:after="60" w:line="290"/>
+      </w:pPr>
+      <w:r>
+        <w:rPr>
+          <w:color w:val="0F172A"/>
+          <w:sz w:val="22"/>
+          <w:szCs w:val="22"/>
+        </w:rPr>
+        <w:t xml:space="preserve">Contact reveal: the customer's name, phone and email are hidden or partly masked (last two digits / first letter + domain) until the worker buys the lead — and a FREE-plan buyer stays at the partial reveal (the subscription lever). A lead that becomes a booking always reveals.</w:t>
+      </w:r>
+    </w:p>
+    <w:p>
+      <w:pPr>
+        <w:pStyle w:val="ListParagraph"/>
+        <w:numPr>
+          <w:ilvl w:val="0"/>
+          <w:numId w:val="1"/>
+        </w:numPr>
+        <w:spacing w:after="60" w:line="290"/>
+      </w:pPr>
+      <w:r>
+        <w:rPr>
+          <w:color w:val="0F172A"/>
+          <w:sz w:val="22"/>
+          <w:szCs w:val="22"/>
+        </w:rPr>
+        <w:t xml:space="preserve">Lead rebate: when a job whose lead you BOUGHT is completed, the lead's value is credited back to you as a reduction of the platform fee on that job — so buying a lead lowers the effective take rate on the work it wins. The rebate can never exceed the fee on the job or the price you paid for the lead.</w:t>
+      </w:r>
+    </w:p>
+    <w:p>
+      <w:pPr>
+        <w:pStyle w:val="ListParagraph"/>
+        <w:numPr>
+          <w:ilvl w:val="0"/>
+          <w:numId w:val="1"/>
+        </w:numPr>
+        <w:spacing w:after="60" w:line="290"/>
+      </w:pPr>
+      <w:r>
+        <w:rPr>
+          <w:color w:val="0F172A"/>
+          <w:sz w:val="22"/>
+          <w:szCs w:val="22"/>
+        </w:rPr>
+        <w:t xml:space="preserve">Workers the customer invited directly are never charged: they already hold the job, so the marketplace only sells the matches the customer did not make.</w:t>
+      </w:r>
+    </w:p>
+    <w:p>
+      <w:pPr>
+        <w:pStyle w:val="ListParagraph"/>
+        <w:numPr>
+          <w:ilvl w:val="0"/>
+          <w:numId w:val="1"/>
+        </w:numPr>
+        <w:spacing w:after="60" w:line="290"/>
+      </w:pPr>
+      <w:r>
+        <w:rPr>
+          <w:color w:val="0F172A"/>
+          <w:sz w:val="22"/>
+          <w:szCs w:val="22"/>
+        </w:rPr>
+        <w:t xml:space="preserve">Admin audit: recent offers (grade, match score, price, status) and the full credit ledger, plus an adjustment form to grant or claw back credits.</w:t>
+      </w:r>
+    </w:p>
+    <w:p>
+      <w:pPr>
+        <w:pStyle w:val="Heading3"/>
+        <w:spacing w:before="200" w:after="80"/>
+      </w:pPr>
+      <w:r>
+        <w:rPr>
+          <w:b/>
+          <w:bCs/>
+          <w:color w:val="0F172A"/>
+          <w:sz w:val="24"/>
+          <w:szCs w:val="24"/>
+        </w:rPr>
+        <w:t xml:space="preserve">Step by step</w:t>
+      </w:r>
+    </w:p>
+    <w:p>
+      <w:pPr>
+        <w:spacing w:after="70" w:line="290"/>
+        <w:ind w:left="260" w:hanging="260"/>
+      </w:pPr>
+      <w:r>
+        <w:rPr>
+          <w:b/>
+          <w:bCs/>
+          <w:color w:val="0E7490"/>
+          <w:sz w:val="22"/>
+          <w:szCs w:val="22"/>
+        </w:rPr>
+        <w:t xml:space="preserve">1. </w:t>
+      </w:r>
+      <w:r>
+        <w:rPr>
+          <w:color w:val="0F172A"/>
+          <w:sz w:val="22"/>
+          <w:szCs w:val="22"/>
+        </w:rPr>
+        <w:t xml:space="preserve">As the worker, open /dashboard/leads from the dashboard's Lead marketplace card and check your credit balance.</w:t>
+      </w:r>
+    </w:p>
+    <w:p>
+      <w:pPr>
+        <w:spacing w:after="70" w:line="290"/>
+        <w:ind w:left="260" w:hanging="260"/>
+      </w:pPr>
+      <w:r>
+        <w:rPr>
+          <w:b/>
+          <w:bCs/>
+          <w:color w:val="0E7490"/>
+          <w:sz w:val="22"/>
+          <w:szCs w:val="22"/>
+        </w:rPr>
+        <w:t xml:space="preserve">2. </w:t>
+      </w:r>
+      <w:r>
+        <w:rPr>
+          <w:color w:val="0F172A"/>
+          <w:sz w:val="22"/>
+          <w:szCs w:val="22"/>
+        </w:rPr>
+        <w:t xml:space="preserve">Review the Available tab: each row shows the grade, the lead number, the job, the price in credits, the match score, why you were matched, and a live countdown.</w:t>
+      </w:r>
+    </w:p>
+    <w:p>
+      <w:pPr>
+        <w:spacing w:after="70" w:line="290"/>
+        <w:ind w:left="260" w:hanging="260"/>
+      </w:pPr>
+      <w:r>
+        <w:rPr>
+          <w:b/>
+          <w:bCs/>
+          <w:color w:val="0E7490"/>
+          <w:sz w:val="22"/>
+          <w:szCs w:val="22"/>
+        </w:rPr>
+        <w:t xml:space="preserve">3. </w:t>
+      </w:r>
+      <w:r>
+        <w:rPr>
+          <w:color w:val="0F172A"/>
+          <w:sz w:val="22"/>
+          <w:szCs w:val="22"/>
+        </w:rPr>
+        <w:t xml:space="preserve">Click Unlock for N credits on the lead you want; the credits are debited once and the customer's contact details appear under Purchased.</w:t>
+      </w:r>
+    </w:p>
+    <w:p>
+      <w:pPr>
+        <w:spacing w:after="70" w:line="290"/>
+        <w:ind w:left="260" w:hanging="260"/>
+      </w:pPr>
+      <w:r>
+        <w:rPr>
+          <w:b/>
+          <w:bCs/>
+          <w:color w:val="0E7490"/>
+          <w:sz w:val="22"/>
+          <w:szCs w:val="22"/>
+        </w:rPr>
+        <w:t xml:space="preserve">4. </w:t>
+      </w:r>
+      <w:r>
+        <w:rPr>
+          <w:color w:val="0F172A"/>
+          <w:sz w:val="22"/>
+          <w:szCs w:val="22"/>
+        </w:rPr>
+        <w:t xml:space="preserve">Quote the customer directly and run the job through the normal booking flow (3.4 – 3.7).</w:t>
+      </w:r>
+    </w:p>
+    <w:p>
+      <w:pPr>
+        <w:spacing w:after="70" w:line="290"/>
+        <w:ind w:left="260" w:hanging="260"/>
+      </w:pPr>
+      <w:r>
+        <w:rPr>
+          <w:b/>
+          <w:bCs/>
+          <w:color w:val="0E7490"/>
+          <w:sz w:val="22"/>
+          <w:szCs w:val="22"/>
+        </w:rPr>
+        <w:t xml:space="preserve">5. </w:t>
+      </w:r>
+      <w:r>
+        <w:rPr>
+          <w:color w:val="0F172A"/>
+          <w:sz w:val="22"/>
+          <w:szCs w:val="22"/>
+        </w:rPr>
+        <w:t xml:space="preserve">As the admin, open /admin/revenue-settings → Lead marketplace to set the prices per grade, how many workers see a request, the offer window, exclusivity, the four contact-reveal rules and the matching weights, then publish (this appends a new rule version — offers already created keep their price).</w:t>
+      </w:r>
+    </w:p>
+    <w:p>
+      <w:pPr>
+        <w:spacing w:after="70" w:line="290"/>
+        <w:ind w:left="260" w:hanging="260"/>
+      </w:pPr>
+      <w:r>
+        <w:rPr>
+          <w:b/>
+          <w:bCs/>
+          <w:color w:val="0E7490"/>
+          <w:sz w:val="22"/>
+          <w:szCs w:val="22"/>
+        </w:rPr>
+        <w:t xml:space="preserve">6. </w:t>
+      </w:r>
+      <w:r>
+        <w:rPr>
+          <w:color w:val="0F172A"/>
+          <w:sz w:val="22"/>
+          <w:szCs w:val="22"/>
+        </w:rPr>
+        <w:t xml:space="preserve">Complete a job that came from a lead you bought and check your booking row: the platform fee is shown with the lead rebate applied, and the net payout reflects it.</w:t>
+      </w:r>
+    </w:p>
+    <w:p>
+      <w:pPr>
+        <w:spacing w:after="70" w:line="290"/>
+        <w:ind w:left="260" w:hanging="260"/>
+      </w:pPr>
+      <w:r>
+        <w:rPr>
+          <w:b/>
+          <w:bCs/>
+          <w:color w:val="0E7490"/>
+          <w:sz w:val="22"/>
+          <w:szCs w:val="22"/>
+        </w:rPr>
+        <w:t xml:space="preserve">7. </w:t>
+      </w:r>
+      <w:r>
+        <w:rPr>
+          <w:color w:val="0F172A"/>
+          <w:sz w:val="22"/>
+          <w:szCs w:val="22"/>
+        </w:rPr>
+        <w:t xml:space="preserve">As the admin, turn the lead rebate on or off, set the share of the fee it may return and any per-job ceiling, and audit what has been given back.</w:t>
+      </w:r>
+    </w:p>
+    <w:p>
+      <w:pPr>
+        <w:spacing w:after="70" w:line="290"/>
+        <w:ind w:left="260" w:hanging="260"/>
+      </w:pPr>
+      <w:r>
+        <w:rPr>
+          <w:b/>
+          <w:bCs/>
+          <w:color w:val="0E7490"/>
+          <w:sz w:val="22"/>
+          <w:szCs w:val="22"/>
+        </w:rPr>
+        <w:t xml:space="preserve">8. </w:t>
+      </w:r>
+      <w:r>
+        <w:rPr>
+          <w:color w:val="0F172A"/>
+          <w:sz w:val="22"/>
+          <w:szCs w:val="22"/>
+        </w:rPr>
+        <w:t xml:space="preserve">Audit the marketplace in the same panel: the recent-offers list, the credit ledger, and the grant-credits form for goodwill or corrections.</w:t>
       </w:r>
     </w:p>
     <w:p>

</xml_diff>

<commit_message>
docs: regenerate user manual with current pricing and new features
Update generate-user-manual.mjs to reflect the current plan catalog
($15/$39/$99/$199), category-adjusted pricing, 30-day trial, annual
billing (9 for 12), tiered take rates (4–12%), lead marketplace
($5–$35), credit purchases, referrals, smart pricing, and all new
modules (ROI dashboard, earnings statement, lead quality analytics,
portfolio builder, mobile features, referral program).

Regenerated WorkersArena-User-Manual.docx with all updates.

Generated with Codebuff 🤖
Co-Authored-By: Codebuff <noreply@codebuff.com>
</commit_message>
<xml_diff>
--- a/docs/WorkersArena-User-Manual.docx
+++ b/docs/WorkersArena-User-Manual.docx
@@ -61,7 +61,7 @@
           <w:sz w:val="18"/>
           <w:szCs w:val="18"/>
         </w:rPr>
-        <w:t xml:space="preserve">Generated 2026-09-14 — regenerated by `npm run docs:manual` (runs in the standard check `npm run test:all`), so this document always matches the shipped application.</w:t>
+        <w:t xml:space="preserve">Generated 2026-09-17 — regenerated by `npm run docs:manual` (runs in the standard check `npm run test:all`), so this document always matches the shipped application.</w:t>
       </w:r>
     </w:p>
     <w:p>
@@ -556,7 +556,7 @@
                 <w:sz w:val="19"/>
                 <w:szCs w:val="19"/>
               </w:rPr>
-              <w:t xml:space="preserve">Maintain the profile, respond to requests (accept with a quote / decline), bid in multi-candidate quote jobs, negotiate in chat, complete jobs for customer confirmation, withdraw earnings, buy subscriptions and upgrades</w:t>
+              <w:t xml:space="preserve">Maintain the profile, respond to requests (accept with a quote / decline), bid in multi-candidate quote jobs, negotiate in chat, complete jobs for customer confirmation, withdraw earnings, buy subscriptions, upgrades, and lead credits</w:t>
             </w:r>
           </w:p>
         </w:tc>
@@ -580,7 +580,7 @@
                 <w:sz w:val="19"/>
                 <w:szCs w:val="19"/>
               </w:rPr>
-              <w:t xml:space="preserve">Subscription $29–$299/mo (Basic / Professional / Premium / Enterprise) + optional add-ons; 7% platform take rate on accepted quotes (waived on Enterprise)</w:t>
+              <w:t xml:space="preserve">Subscription $15–$199/mo (Starter / Growth / Pro / Business) with 30-day free trial + category-adjusted pricing + optional add-ons; 4–12% platform take rate on accepted quotes (waived on Business); lead marketplace $5–$35 per qualified lead</w:t>
             </w:r>
           </w:p>
         </w:tc>
@@ -3507,25 +3507,25 @@
           <w:sz w:val="22"/>
           <w:szCs w:val="22"/>
         </w:rPr>
-        <w:t xml:space="preserve">Plans: Basic $29, Professional $59, Premium $119, Enterprise $299 per month (annual billing = 10 paid months for 12).</w:t>
-      </w:r>
-    </w:p>
-    <w:p>
-      <w:pPr>
-        <w:pStyle w:val="ListParagraph"/>
-        <w:numPr>
-          <w:ilvl w:val="0"/>
-          <w:numId w:val="1"/>
-        </w:numPr>
-        <w:spacing w:after="60" w:line="290"/>
-      </w:pPr>
-      <w:r>
-        <w:rPr>
-          <w:color w:val="0F172A"/>
-          <w:sz w:val="22"/>
-          <w:szCs w:val="22"/>
-        </w:rPr>
-        <w:t xml:space="preserve">Expired subscriptions hide the worker from public search — the natural upsell trigger; renewal reminders fire at 7 / 3 / 1 days.</w:t>
+        <w:t xml:space="preserve">Plans: Starter $15, Growth $39, Pro $99, Business $199 per month (annual billing = 9 paid months for 12, 25% discount). Category-adjusted pricing: low-value trades (cleaning, gardening) pay 0.5×, high-value trades (HVAC, mechanic) pay 1.5×. 30-day free trial on any plan.</w:t>
+      </w:r>
+    </w:p>
+    <w:p>
+      <w:pPr>
+        <w:pStyle w:val="ListParagraph"/>
+        <w:numPr>
+          <w:ilvl w:val="0"/>
+          <w:numId w:val="1"/>
+        </w:numPr>
+        <w:spacing w:after="60" w:line="290"/>
+      </w:pPr>
+      <w:r>
+        <w:rPr>
+          <w:color w:val="0F172A"/>
+          <w:sz w:val="22"/>
+          <w:szCs w:val="22"/>
+        </w:rPr>
+        <w:t xml:space="preserve">Expired subscriptions hide the worker from public search — the natural upsell trigger; renewal reminders fire at 7 / 3 / 1 days. All plan prices, quotas, and features are admin-editable via /admin/revenue-settings.</w:t>
       </w:r>
     </w:p>
     <w:p>
@@ -6374,6 +6374,1576 @@
           <w:szCs w:val="22"/>
         </w:rPr>
         <w:t xml:space="preserve">Audit the marketplace in the same panel: the recent-offers list, the credit ledger, and the grant-credits form for goodwill or corrections.</w:t>
+      </w:r>
+    </w:p>
+    <w:p>
+      <w:pPr>
+        <w:pStyle w:val="Heading2"/>
+        <w:spacing w:before="260" w:after="100"/>
+      </w:pPr>
+      <w:r>
+        <w:rPr>
+          <w:b/>
+          <w:bCs/>
+          <w:color w:val="0E7490"/>
+          <w:sz w:val="28"/>
+          <w:szCs w:val="28"/>
+        </w:rPr>
+        <w:t xml:space="preserve">3.18 Worker ROI dashboard</w:t>
+      </w:r>
+    </w:p>
+    <w:p>
+      <w:pPr>
+        <w:spacing w:after="120" w:line="300"/>
+      </w:pPr>
+      <w:r>
+        <w:rPr>
+          <w:color w:val="0F172A"/>
+          <w:sz w:val="22"/>
+          <w:szCs w:val="22"/>
+        </w:rPr>
+        <w:t xml:space="preserve">A per-month breakdown of the worker's marketplace spend and return, so they can see whether buying leads and paying the take rate is worth it.</w:t>
+      </w:r>
+    </w:p>
+    <w:p>
+      <w:pPr>
+        <w:shd w:fill="E0F2FE" w:val="clear"/>
+        <w:spacing w:after="100" w:line="290"/>
+      </w:pPr>
+      <w:r>
+        <w:rPr>
+          <w:b/>
+          <w:bCs/>
+          <w:color w:val="0E7490"/>
+          <w:sz w:val="22"/>
+          <w:szCs w:val="22"/>
+        </w:rPr>
+        <w:t xml:space="preserve">Roles involved: </w:t>
+      </w:r>
+      <w:r>
+        <w:rPr>
+          <w:color w:val="0F172A"/>
+          <w:sz w:val="22"/>
+          <w:szCs w:val="22"/>
+        </w:rPr>
+      </w:r>
+    </w:p>
+    <w:p>
+      <w:pPr>
+        <w:pStyle w:val="Heading3"/>
+        <w:spacing w:before="200" w:after="80"/>
+      </w:pPr>
+      <w:r>
+        <w:rPr>
+          <w:b/>
+          <w:bCs/>
+          <w:color w:val="0F172A"/>
+          <w:sz w:val="24"/>
+          <w:szCs w:val="24"/>
+        </w:rPr>
+        <w:t xml:space="preserve">Functionality</w:t>
+      </w:r>
+    </w:p>
+    <w:p>
+      <w:pPr>
+        <w:pStyle w:val="ListParagraph"/>
+        <w:numPr>
+          <w:ilvl w:val="0"/>
+          <w:numId w:val="1"/>
+        </w:numPr>
+        <w:spacing w:after="60" w:line="290"/>
+      </w:pPr>
+      <w:r>
+        <w:rPr>
+          <w:color w:val="0F172A"/>
+          <w:sz w:val="22"/>
+          <w:szCs w:val="22"/>
+        </w:rPr>
+        <w:t xml:space="preserve">Monthly cards: leads bought, quotes sent, jobs won, GMV (gross merchandise value), platform fees paid, subscription cost, total marketplace spend, and the resulting ROI multiple (earnings ÷ spend).</w:t>
+      </w:r>
+    </w:p>
+    <w:p>
+      <w:pPr>
+        <w:pStyle w:val="ListParagraph"/>
+        <w:numPr>
+          <w:ilvl w:val="0"/>
+          <w:numId w:val="1"/>
+        </w:numPr>
+        <w:spacing w:after="60" w:line="290"/>
+      </w:pPr>
+      <w:r>
+        <w:rPr>
+          <w:color w:val="0F172A"/>
+          <w:sz w:val="22"/>
+          <w:szCs w:val="22"/>
+        </w:rPr>
+        <w:t xml:space="preserve">Trend chart showing spend efficiency over time.</w:t>
+      </w:r>
+    </w:p>
+    <w:p>
+      <w:pPr>
+        <w:pStyle w:val="ListParagraph"/>
+        <w:numPr>
+          <w:ilvl w:val="0"/>
+          <w:numId w:val="1"/>
+        </w:numPr>
+        <w:spacing w:after="60" w:line="290"/>
+      </w:pPr>
+      <w:r>
+        <w:rPr>
+          <w:color w:val="0F172A"/>
+          <w:sz w:val="22"/>
+          <w:szCs w:val="22"/>
+        </w:rPr>
+        <w:t xml:space="preserve">Accessible from the dashboard's ROI card or /dashboard/roi.</w:t>
+      </w:r>
+    </w:p>
+    <w:p>
+      <w:pPr>
+        <w:pStyle w:val="Heading3"/>
+        <w:spacing w:before="200" w:after="80"/>
+      </w:pPr>
+      <w:r>
+        <w:rPr>
+          <w:b/>
+          <w:bCs/>
+          <w:color w:val="0F172A"/>
+          <w:sz w:val="24"/>
+          <w:szCs w:val="24"/>
+        </w:rPr>
+        <w:t xml:space="preserve">Step by step</w:t>
+      </w:r>
+    </w:p>
+    <w:p>
+      <w:pPr>
+        <w:spacing w:after="70" w:line="290"/>
+        <w:ind w:left="260" w:hanging="260"/>
+      </w:pPr>
+      <w:r>
+        <w:rPr>
+          <w:b/>
+          <w:bCs/>
+          <w:color w:val="0E7490"/>
+          <w:sz w:val="22"/>
+          <w:szCs w:val="22"/>
+        </w:rPr>
+        <w:t xml:space="preserve">1. </w:t>
+      </w:r>
+      <w:r>
+        <w:rPr>
+          <w:color w:val="0F172A"/>
+          <w:sz w:val="22"/>
+          <w:szCs w:val="22"/>
+        </w:rPr>
+        <w:t xml:space="preserve">Open the dashboard and click the ROI card or navigate to /dashboard/roi.</w:t>
+      </w:r>
+    </w:p>
+    <w:p>
+      <w:pPr>
+        <w:spacing w:after="70" w:line="290"/>
+        <w:ind w:left="260" w:hanging="260"/>
+      </w:pPr>
+      <w:r>
+        <w:rPr>
+          <w:b/>
+          <w:bCs/>
+          <w:color w:val="0E7490"/>
+          <w:sz w:val="22"/>
+          <w:szCs w:val="22"/>
+        </w:rPr>
+        <w:t xml:space="preserve">2. </w:t>
+      </w:r>
+      <w:r>
+        <w:rPr>
+          <w:color w:val="0F172A"/>
+          <w:sz w:val="22"/>
+          <w:szCs w:val="22"/>
+        </w:rPr>
+        <w:t xml:space="preserve">Select the month to view (defaults to the current month).</w:t>
+      </w:r>
+    </w:p>
+    <w:p>
+      <w:pPr>
+        <w:spacing w:after="70" w:line="290"/>
+        <w:ind w:left="260" w:hanging="260"/>
+      </w:pPr>
+      <w:r>
+        <w:rPr>
+          <w:b/>
+          <w:bCs/>
+          <w:color w:val="0E7490"/>
+          <w:sz w:val="22"/>
+          <w:szCs w:val="22"/>
+        </w:rPr>
+        <w:t xml:space="preserve">3. </w:t>
+      </w:r>
+      <w:r>
+        <w:rPr>
+          <w:color w:val="0F172A"/>
+          <w:sz w:val="22"/>
+          <w:szCs w:val="22"/>
+        </w:rPr>
+        <w:t xml:space="preserve">Review the KPI cards: leads bought, jobs won, GMV, fees, subscription cost, total spend, and ROI multiple.</w:t>
+      </w:r>
+    </w:p>
+    <w:p>
+      <w:pPr>
+        <w:spacing w:after="70" w:line="290"/>
+        <w:ind w:left="260" w:hanging="260"/>
+      </w:pPr>
+      <w:r>
+        <w:rPr>
+          <w:b/>
+          <w:bCs/>
+          <w:color w:val="0E7490"/>
+          <w:sz w:val="22"/>
+          <w:szCs w:val="22"/>
+        </w:rPr>
+        <w:t xml:space="preserve">4. </w:t>
+      </w:r>
+      <w:r>
+        <w:rPr>
+          <w:color w:val="0F172A"/>
+          <w:sz w:val="22"/>
+          <w:szCs w:val="22"/>
+        </w:rPr>
+        <w:t xml:space="preserve">Compare months to see whether your marketplace spend is becoming more efficient over time.</w:t>
+      </w:r>
+    </w:p>
+    <w:p>
+      <w:pPr>
+        <w:pStyle w:val="Heading2"/>
+        <w:spacing w:before="260" w:after="100"/>
+      </w:pPr>
+      <w:r>
+        <w:rPr>
+          <w:b/>
+          <w:bCs/>
+          <w:color w:val="0E7490"/>
+          <w:sz w:val="28"/>
+          <w:szCs w:val="28"/>
+        </w:rPr>
+        <w:t xml:space="preserve">3.19 Earnings statement</w:t>
+      </w:r>
+    </w:p>
+    <w:p>
+      <w:pPr>
+        <w:spacing w:after="120" w:line="300"/>
+      </w:pPr>
+      <w:r>
+        <w:rPr>
+          <w:color w:val="0F172A"/>
+          <w:sz w:val="22"/>
+          <w:szCs w:val="22"/>
+        </w:rPr>
+        <w:t xml:space="preserve">A monthly financial statement showing completed jobs, platform fees deducted, lead rebates applied, and net earnings — the worker's P&amp;L on the platform.</w:t>
+      </w:r>
+    </w:p>
+    <w:p>
+      <w:pPr>
+        <w:shd w:fill="E0F2FE" w:val="clear"/>
+        <w:spacing w:after="100" w:line="290"/>
+      </w:pPr>
+      <w:r>
+        <w:rPr>
+          <w:b/>
+          <w:bCs/>
+          <w:color w:val="0E7490"/>
+          <w:sz w:val="22"/>
+          <w:szCs w:val="22"/>
+        </w:rPr>
+        <w:t xml:space="preserve">Roles involved: </w:t>
+      </w:r>
+      <w:r>
+        <w:rPr>
+          <w:color w:val="0F172A"/>
+          <w:sz w:val="22"/>
+          <w:szCs w:val="22"/>
+        </w:rPr>
+      </w:r>
+    </w:p>
+    <w:p>
+      <w:pPr>
+        <w:pStyle w:val="Heading3"/>
+        <w:spacing w:before="200" w:after="80"/>
+      </w:pPr>
+      <w:r>
+        <w:rPr>
+          <w:b/>
+          <w:bCs/>
+          <w:color w:val="0F172A"/>
+          <w:sz w:val="24"/>
+          <w:szCs w:val="24"/>
+        </w:rPr>
+        <w:t xml:space="preserve">Functionality</w:t>
+      </w:r>
+    </w:p>
+    <w:p>
+      <w:pPr>
+        <w:pStyle w:val="ListParagraph"/>
+        <w:numPr>
+          <w:ilvl w:val="0"/>
+          <w:numId w:val="1"/>
+        </w:numPr>
+        <w:spacing w:after="60" w:line="290"/>
+      </w:pPr>
+      <w:r>
+        <w:rPr>
+          <w:color w:val="0F172A"/>
+          <w:sz w:val="22"/>
+          <w:szCs w:val="22"/>
+        </w:rPr>
+        <w:t xml:space="preserve">Monthly breakdown: completed jobs count, GMV, platform fees, lead rebates, net earnings.</w:t>
+      </w:r>
+    </w:p>
+    <w:p>
+      <w:pPr>
+        <w:pStyle w:val="ListParagraph"/>
+        <w:numPr>
+          <w:ilvl w:val="0"/>
+          <w:numId w:val="1"/>
+        </w:numPr>
+        <w:spacing w:after="60" w:line="290"/>
+      </w:pPr>
+      <w:r>
+        <w:rPr>
+          <w:color w:val="0F172A"/>
+          <w:sz w:val="22"/>
+          <w:szCs w:val="22"/>
+        </w:rPr>
+        <w:t xml:space="preserve">Per-job detail: each completed job shows the quote, fee, rebate (if applicable), and net amount.</w:t>
+      </w:r>
+    </w:p>
+    <w:p>
+      <w:pPr>
+        <w:pStyle w:val="ListParagraph"/>
+        <w:numPr>
+          <w:ilvl w:val="0"/>
+          <w:numId w:val="1"/>
+        </w:numPr>
+        <w:spacing w:after="60" w:line="290"/>
+      </w:pPr>
+      <w:r>
+        <w:rPr>
+          <w:color w:val="0F172A"/>
+          <w:sz w:val="22"/>
+          <w:szCs w:val="22"/>
+        </w:rPr>
+        <w:t xml:space="preserve">Accessible from the dashboard's Earnings card or /dashboard/earnings.</w:t>
+      </w:r>
+    </w:p>
+    <w:p>
+      <w:pPr>
+        <w:pStyle w:val="Heading3"/>
+        <w:spacing w:before="200" w:after="80"/>
+      </w:pPr>
+      <w:r>
+        <w:rPr>
+          <w:b/>
+          <w:bCs/>
+          <w:color w:val="0F172A"/>
+          <w:sz w:val="24"/>
+          <w:szCs w:val="24"/>
+        </w:rPr>
+        <w:t xml:space="preserve">Step by step</w:t>
+      </w:r>
+    </w:p>
+    <w:p>
+      <w:pPr>
+        <w:spacing w:after="70" w:line="290"/>
+        <w:ind w:left="260" w:hanging="260"/>
+      </w:pPr>
+      <w:r>
+        <w:rPr>
+          <w:b/>
+          <w:bCs/>
+          <w:color w:val="0E7490"/>
+          <w:sz w:val="22"/>
+          <w:szCs w:val="22"/>
+        </w:rPr>
+        <w:t xml:space="preserve">1. </w:t>
+      </w:r>
+      <w:r>
+        <w:rPr>
+          <w:color w:val="0F172A"/>
+          <w:sz w:val="22"/>
+          <w:szCs w:val="22"/>
+        </w:rPr>
+        <w:t xml:space="preserve">Open the dashboard and click the Earnings card or navigate to /dashboard/earnings.</w:t>
+      </w:r>
+    </w:p>
+    <w:p>
+      <w:pPr>
+        <w:spacing w:after="70" w:line="290"/>
+        <w:ind w:left="260" w:hanging="260"/>
+      </w:pPr>
+      <w:r>
+        <w:rPr>
+          <w:b/>
+          <w:bCs/>
+          <w:color w:val="0E7490"/>
+          <w:sz w:val="22"/>
+          <w:szCs w:val="22"/>
+        </w:rPr>
+        <w:t xml:space="preserve">2. </w:t>
+      </w:r>
+      <w:r>
+        <w:rPr>
+          <w:color w:val="0F172A"/>
+          <w:sz w:val="22"/>
+          <w:szCs w:val="22"/>
+        </w:rPr>
+        <w:t xml:space="preserve">Select the month to view (defaults to the current month).</w:t>
+      </w:r>
+    </w:p>
+    <w:p>
+      <w:pPr>
+        <w:spacing w:after="70" w:line="290"/>
+        <w:ind w:left="260" w:hanging="260"/>
+      </w:pPr>
+      <w:r>
+        <w:rPr>
+          <w:b/>
+          <w:bCs/>
+          <w:color w:val="0E7490"/>
+          <w:sz w:val="22"/>
+          <w:szCs w:val="22"/>
+        </w:rPr>
+        <w:t xml:space="preserve">3. </w:t>
+      </w:r>
+      <w:r>
+        <w:rPr>
+          <w:color w:val="0F172A"/>
+          <w:sz w:val="22"/>
+          <w:szCs w:val="22"/>
+        </w:rPr>
+        <w:t xml:space="preserve">Review the summary: total jobs, GMV, fees, rebates, and net earnings.</w:t>
+      </w:r>
+    </w:p>
+    <w:p>
+      <w:pPr>
+        <w:spacing w:after="70" w:line="290"/>
+        <w:ind w:left="260" w:hanging="260"/>
+      </w:pPr>
+      <w:r>
+        <w:rPr>
+          <w:b/>
+          <w:bCs/>
+          <w:color w:val="0E7490"/>
+          <w:sz w:val="22"/>
+          <w:szCs w:val="22"/>
+        </w:rPr>
+        <w:t xml:space="preserve">4. </w:t>
+      </w:r>
+      <w:r>
+        <w:rPr>
+          <w:color w:val="0F172A"/>
+          <w:sz w:val="22"/>
+          <w:szCs w:val="22"/>
+        </w:rPr>
+        <w:t xml:space="preserve">Expand the per-job detail to see the breakdown for each completed job.</w:t>
+      </w:r>
+    </w:p>
+    <w:p>
+      <w:pPr>
+        <w:pStyle w:val="Heading2"/>
+        <w:spacing w:before="260" w:after="100"/>
+      </w:pPr>
+      <w:r>
+        <w:rPr>
+          <w:b/>
+          <w:bCs/>
+          <w:color w:val="0E7490"/>
+          <w:sz w:val="28"/>
+          <w:szCs w:val="28"/>
+        </w:rPr>
+        <w:t xml:space="preserve">3.20 Lead quality analytics (admin)</w:t>
+      </w:r>
+    </w:p>
+    <w:p>
+      <w:pPr>
+        <w:spacing w:after="120" w:line="300"/>
+      </w:pPr>
+      <w:r>
+        <w:rPr>
+          <w:color w:val="0F172A"/>
+          <w:sz w:val="22"/>
+          <w:szCs w:val="22"/>
+        </w:rPr>
+        <w:t xml:space="preserve">An admin dashboard for monitoring lead quality trends, worker feedback, and the impact of the quality feedback loop on pricing and matching.</w:t>
+      </w:r>
+    </w:p>
+    <w:p>
+      <w:pPr>
+        <w:shd w:fill="E0F2FE" w:val="clear"/>
+        <w:spacing w:after="100" w:line="290"/>
+      </w:pPr>
+      <w:r>
+        <w:rPr>
+          <w:b/>
+          <w:bCs/>
+          <w:color w:val="0E7490"/>
+          <w:sz w:val="22"/>
+          <w:szCs w:val="22"/>
+        </w:rPr>
+        <w:t xml:space="preserve">Roles involved: </w:t>
+      </w:r>
+      <w:r>
+        <w:rPr>
+          <w:color w:val="0F172A"/>
+          <w:sz w:val="22"/>
+          <w:szCs w:val="22"/>
+        </w:rPr>
+      </w:r>
+    </w:p>
+    <w:p>
+      <w:pPr>
+        <w:pStyle w:val="Heading3"/>
+        <w:spacing w:before="200" w:after="80"/>
+      </w:pPr>
+      <w:r>
+        <w:rPr>
+          <w:b/>
+          <w:bCs/>
+          <w:color w:val="0F172A"/>
+          <w:sz w:val="24"/>
+          <w:szCs w:val="24"/>
+        </w:rPr>
+        <w:t xml:space="preserve">Functionality</w:t>
+      </w:r>
+    </w:p>
+    <w:p>
+      <w:pPr>
+        <w:pStyle w:val="ListParagraph"/>
+        <w:numPr>
+          <w:ilvl w:val="0"/>
+          <w:numId w:val="1"/>
+        </w:numPr>
+        <w:spacing w:after="60" w:line="290"/>
+      </w:pPr>
+      <w:r>
+        <w:rPr>
+          <w:color w:val="0F172A"/>
+          <w:sz w:val="22"/>
+          <w:szCs w:val="22"/>
+        </w:rPr>
+        <w:t xml:space="preserve">Weekly rating trends: average worker ratings per grade over time.</w:t>
+      </w:r>
+    </w:p>
+    <w:p>
+      <w:pPr>
+        <w:pStyle w:val="ListParagraph"/>
+        <w:numPr>
+          <w:ilvl w:val="0"/>
+          <w:numId w:val="1"/>
+        </w:numPr>
+        <w:spacing w:after="60" w:line="290"/>
+      </w:pPr>
+      <w:r>
+        <w:rPr>
+          <w:color w:val="0F172A"/>
+          <w:sz w:val="22"/>
+          <w:szCs w:val="22"/>
+        </w:rPr>
+        <w:t xml:space="preserve">Per-grade statistics: conversion rates (lead → booking), average ratings, price multiplier impact.</w:t>
+      </w:r>
+    </w:p>
+    <w:p>
+      <w:pPr>
+        <w:pStyle w:val="ListParagraph"/>
+        <w:numPr>
+          <w:ilvl w:val="0"/>
+          <w:numId w:val="1"/>
+        </w:numPr>
+        <w:spacing w:after="60" w:line="290"/>
+      </w:pPr>
+      <w:r>
+        <w:rPr>
+          <w:color w:val="0F172A"/>
+          <w:sz w:val="22"/>
+          <w:szCs w:val="22"/>
+        </w:rPr>
+        <w:t xml:space="preserve">Worker feedback distribution: how many 1-star, 2-star, etc. ratings per grade.</w:t>
+      </w:r>
+    </w:p>
+    <w:p>
+      <w:pPr>
+        <w:pStyle w:val="ListParagraph"/>
+        <w:numPr>
+          <w:ilvl w:val="0"/>
+          <w:numId w:val="1"/>
+        </w:numPr>
+        <w:spacing w:after="60" w:line="290"/>
+      </w:pPr>
+      <w:r>
+        <w:rPr>
+          <w:color w:val="0F172A"/>
+          <w:sz w:val="22"/>
+          <w:szCs w:val="22"/>
+        </w:rPr>
+        <w:t xml:space="preserve">Accessible from /admin/analytics/lead-quality.</w:t>
+      </w:r>
+    </w:p>
+    <w:p>
+      <w:pPr>
+        <w:pStyle w:val="Heading3"/>
+        <w:spacing w:before="200" w:after="80"/>
+      </w:pPr>
+      <w:r>
+        <w:rPr>
+          <w:b/>
+          <w:bCs/>
+          <w:color w:val="0F172A"/>
+          <w:sz w:val="24"/>
+          <w:szCs w:val="24"/>
+        </w:rPr>
+        <w:t xml:space="preserve">Step by step</w:t>
+      </w:r>
+    </w:p>
+    <w:p>
+      <w:pPr>
+        <w:spacing w:after="70" w:line="290"/>
+        <w:ind w:left="260" w:hanging="260"/>
+      </w:pPr>
+      <w:r>
+        <w:rPr>
+          <w:b/>
+          <w:bCs/>
+          <w:color w:val="0E7490"/>
+          <w:sz w:val="22"/>
+          <w:szCs w:val="22"/>
+        </w:rPr>
+        <w:t xml:space="preserve">1. </w:t>
+      </w:r>
+      <w:r>
+        <w:rPr>
+          <w:color w:val="0F172A"/>
+          <w:sz w:val="22"/>
+          <w:szCs w:val="22"/>
+        </w:rPr>
+        <w:t xml:space="preserve">Open /admin/analytics/lead-quality to view the lead quality dashboard.</w:t>
+      </w:r>
+    </w:p>
+    <w:p>
+      <w:pPr>
+        <w:spacing w:after="70" w:line="290"/>
+        <w:ind w:left="260" w:hanging="260"/>
+      </w:pPr>
+      <w:r>
+        <w:rPr>
+          <w:b/>
+          <w:bCs/>
+          <w:color w:val="0E7490"/>
+          <w:sz w:val="22"/>
+          <w:szCs w:val="22"/>
+        </w:rPr>
+        <w:t xml:space="preserve">2. </w:t>
+      </w:r>
+      <w:r>
+        <w:rPr>
+          <w:color w:val="0F172A"/>
+          <w:sz w:val="22"/>
+          <w:szCs w:val="22"/>
+        </w:rPr>
+        <w:t xml:space="preserve">Review the weekly rating trends chart to see how worker satisfaction is trending.</w:t>
+      </w:r>
+    </w:p>
+    <w:p>
+      <w:pPr>
+        <w:spacing w:after="70" w:line="290"/>
+        <w:ind w:left="260" w:hanging="260"/>
+      </w:pPr>
+      <w:r>
+        <w:rPr>
+          <w:b/>
+          <w:bCs/>
+          <w:color w:val="0E7490"/>
+          <w:sz w:val="22"/>
+          <w:szCs w:val="22"/>
+        </w:rPr>
+        <w:t xml:space="preserve">3. </w:t>
+      </w:r>
+      <w:r>
+        <w:rPr>
+          <w:color w:val="0F172A"/>
+          <w:sz w:val="22"/>
+          <w:szCs w:val="22"/>
+        </w:rPr>
+        <w:t xml:space="preserve">Check per-grade stats to see which grades have the best conversion rates and highest ratings.</w:t>
+      </w:r>
+    </w:p>
+    <w:p>
+      <w:pPr>
+        <w:spacing w:after="70" w:line="290"/>
+        <w:ind w:left="260" w:hanging="260"/>
+      </w:pPr>
+      <w:r>
+        <w:rPr>
+          <w:b/>
+          <w:bCs/>
+          <w:color w:val="0E7490"/>
+          <w:sz w:val="22"/>
+          <w:szCs w:val="22"/>
+        </w:rPr>
+        <w:t xml:space="preserve">4. </w:t>
+      </w:r>
+      <w:r>
+        <w:rPr>
+          <w:color w:val="0F172A"/>
+          <w:sz w:val="22"/>
+          <w:szCs w:val="22"/>
+        </w:rPr>
+        <w:t xml:space="preserve">Use the insights to adjust grade prices or matching weights in /admin/revenue-settings → Lead marketplace.</w:t>
+      </w:r>
+    </w:p>
+    <w:p>
+      <w:pPr>
+        <w:pStyle w:val="Heading2"/>
+        <w:spacing w:before="260" w:after="100"/>
+      </w:pPr>
+      <w:r>
+        <w:rPr>
+          <w:b/>
+          <w:bCs/>
+          <w:color w:val="0E7490"/>
+          <w:sz w:val="28"/>
+          <w:szCs w:val="28"/>
+        </w:rPr>
+        <w:t xml:space="preserve">3.21 Portfolio builder</w:t>
+      </w:r>
+    </w:p>
+    <w:p>
+      <w:pPr>
+        <w:spacing w:after="120" w:line="300"/>
+      </w:pPr>
+      <w:r>
+        <w:rPr>
+          <w:color w:val="0F172A"/>
+          <w:sz w:val="22"/>
+          <w:szCs w:val="22"/>
+        </w:rPr>
+        <w:t xml:space="preserve">Workers can showcase their best work with before/after photos, bilingual titles, and project descriptions — a visual portfolio on their public profile.</w:t>
+      </w:r>
+    </w:p>
+    <w:p>
+      <w:pPr>
+        <w:shd w:fill="E0F2FE" w:val="clear"/>
+        <w:spacing w:after="100" w:line="290"/>
+      </w:pPr>
+      <w:r>
+        <w:rPr>
+          <w:b/>
+          <w:bCs/>
+          <w:color w:val="0E7490"/>
+          <w:sz w:val="22"/>
+          <w:szCs w:val="22"/>
+        </w:rPr>
+        <w:t xml:space="preserve">Roles involved: </w:t>
+      </w:r>
+      <w:r>
+        <w:rPr>
+          <w:color w:val="0F172A"/>
+          <w:sz w:val="22"/>
+          <w:szCs w:val="22"/>
+        </w:rPr>
+      </w:r>
+    </w:p>
+    <w:p>
+      <w:pPr>
+        <w:pStyle w:val="Heading3"/>
+        <w:spacing w:before="200" w:after="80"/>
+      </w:pPr>
+      <w:r>
+        <w:rPr>
+          <w:b/>
+          <w:bCs/>
+          <w:color w:val="0F172A"/>
+          <w:sz w:val="24"/>
+          <w:szCs w:val="24"/>
+        </w:rPr>
+        <w:t xml:space="preserve">Functionality</w:t>
+      </w:r>
+    </w:p>
+    <w:p>
+      <w:pPr>
+        <w:pStyle w:val="ListParagraph"/>
+        <w:numPr>
+          <w:ilvl w:val="0"/>
+          <w:numId w:val="1"/>
+        </w:numPr>
+        <w:spacing w:after="60" w:line="290"/>
+      </w:pPr>
+      <w:r>
+        <w:rPr>
+          <w:color w:val="0F172A"/>
+          <w:sz w:val="22"/>
+          <w:szCs w:val="22"/>
+        </w:rPr>
+        <w:t xml:space="preserve">Add portfolio items with before/after photos (camera capture on mobile, file upload on web).</w:t>
+      </w:r>
+    </w:p>
+    <w:p>
+      <w:pPr>
+        <w:pStyle w:val="ListParagraph"/>
+        <w:numPr>
+          <w:ilvl w:val="0"/>
+          <w:numId w:val="1"/>
+        </w:numPr>
+        <w:spacing w:after="60" w:line="290"/>
+      </w:pPr>
+      <w:r>
+        <w:rPr>
+          <w:color w:val="0F172A"/>
+          <w:sz w:val="22"/>
+          <w:szCs w:val="22"/>
+        </w:rPr>
+        <w:t xml:space="preserve">Bilingual titles (English + Arabic) and project descriptions.</w:t>
+      </w:r>
+    </w:p>
+    <w:p>
+      <w:pPr>
+        <w:pStyle w:val="ListParagraph"/>
+        <w:numPr>
+          <w:ilvl w:val="0"/>
+          <w:numId w:val="1"/>
+        </w:numPr>
+        <w:spacing w:after="60" w:line="290"/>
+      </w:pPr>
+      <w:r>
+        <w:rPr>
+          <w:color w:val="0F172A"/>
+          <w:sz w:val="22"/>
+          <w:szCs w:val="22"/>
+        </w:rPr>
+        <w:t xml:space="preserve">Portfolio items appear on the worker's public profile page.</w:t>
+      </w:r>
+    </w:p>
+    <w:p>
+      <w:pPr>
+        <w:pStyle w:val="ListParagraph"/>
+        <w:numPr>
+          <w:ilvl w:val="0"/>
+          <w:numId w:val="1"/>
+        </w:numPr>
+        <w:spacing w:after="60" w:line="290"/>
+      </w:pPr>
+      <w:r>
+        <w:rPr>
+          <w:color w:val="0F172A"/>
+          <w:sz w:val="22"/>
+          <w:szCs w:val="22"/>
+        </w:rPr>
+        <w:t xml:space="preserve">Accessible from the dashboard's Portfolio card.</w:t>
+      </w:r>
+    </w:p>
+    <w:p>
+      <w:pPr>
+        <w:pStyle w:val="Heading3"/>
+        <w:spacing w:before="200" w:after="80"/>
+      </w:pPr>
+      <w:r>
+        <w:rPr>
+          <w:b/>
+          <w:bCs/>
+          <w:color w:val="0F172A"/>
+          <w:sz w:val="24"/>
+          <w:szCs w:val="24"/>
+        </w:rPr>
+        <w:t xml:space="preserve">Step by step</w:t>
+      </w:r>
+    </w:p>
+    <w:p>
+      <w:pPr>
+        <w:spacing w:after="70" w:line="290"/>
+        <w:ind w:left="260" w:hanging="260"/>
+      </w:pPr>
+      <w:r>
+        <w:rPr>
+          <w:b/>
+          <w:bCs/>
+          <w:color w:val="0E7490"/>
+          <w:sz w:val="22"/>
+          <w:szCs w:val="22"/>
+        </w:rPr>
+        <w:t xml:space="preserve">1. </w:t>
+      </w:r>
+      <w:r>
+        <w:rPr>
+          <w:color w:val="0F172A"/>
+          <w:sz w:val="22"/>
+          <w:szCs w:val="22"/>
+        </w:rPr>
+        <w:t xml:space="preserve">Open the dashboard and click the Portfolio card.</w:t>
+      </w:r>
+    </w:p>
+    <w:p>
+      <w:pPr>
+        <w:spacing w:after="70" w:line="290"/>
+        <w:ind w:left="260" w:hanging="260"/>
+      </w:pPr>
+      <w:r>
+        <w:rPr>
+          <w:b/>
+          <w:bCs/>
+          <w:color w:val="0E7490"/>
+          <w:sz w:val="22"/>
+          <w:szCs w:val="22"/>
+        </w:rPr>
+        <w:t xml:space="preserve">2. </w:t>
+      </w:r>
+      <w:r>
+        <w:rPr>
+          <w:color w:val="0F172A"/>
+          <w:sz w:val="22"/>
+          <w:szCs w:val="22"/>
+        </w:rPr>
+        <w:t xml:space="preserve">Click Add project and enter the title (EN + AR) and description.</w:t>
+      </w:r>
+    </w:p>
+    <w:p>
+      <w:pPr>
+        <w:spacing w:after="70" w:line="290"/>
+        <w:ind w:left="260" w:hanging="260"/>
+      </w:pPr>
+      <w:r>
+        <w:rPr>
+          <w:b/>
+          <w:bCs/>
+          <w:color w:val="0E7490"/>
+          <w:sz w:val="22"/>
+          <w:szCs w:val="22"/>
+        </w:rPr>
+        <w:t xml:space="preserve">3. </w:t>
+      </w:r>
+      <w:r>
+        <w:rPr>
+          <w:color w:val="0F172A"/>
+          <w:sz w:val="22"/>
+          <w:szCs w:val="22"/>
+        </w:rPr>
+        <w:t xml:space="preserve">Upload before/after photos using the camera (mobile) or file picker (web).</w:t>
+      </w:r>
+    </w:p>
+    <w:p>
+      <w:pPr>
+        <w:spacing w:after="70" w:line="290"/>
+        <w:ind w:left="260" w:hanging="260"/>
+      </w:pPr>
+      <w:r>
+        <w:rPr>
+          <w:b/>
+          <w:bCs/>
+          <w:color w:val="0E7490"/>
+          <w:sz w:val="22"/>
+          <w:szCs w:val="22"/>
+        </w:rPr>
+        <w:t xml:space="preserve">4. </w:t>
+      </w:r>
+      <w:r>
+        <w:rPr>
+          <w:color w:val="0F172A"/>
+          <w:sz w:val="22"/>
+          <w:szCs w:val="22"/>
+        </w:rPr>
+        <w:t xml:space="preserve">Save the portfolio item — it appears on your public profile for customers to see.</w:t>
+      </w:r>
+    </w:p>
+    <w:p>
+      <w:pPr>
+        <w:pStyle w:val="Heading2"/>
+        <w:spacing w:before="260" w:after="100"/>
+      </w:pPr>
+      <w:r>
+        <w:rPr>
+          <w:b/>
+          <w:bCs/>
+          <w:color w:val="0E7490"/>
+          <w:sz w:val="28"/>
+          <w:szCs w:val="28"/>
+        </w:rPr>
+        <w:t xml:space="preserve">3.22 Mobile app features</w:t>
+      </w:r>
+    </w:p>
+    <w:p>
+      <w:pPr>
+        <w:spacing w:after="120" w:line="300"/>
+      </w:pPr>
+      <w:r>
+        <w:rPr>
+          <w:color w:val="0F172A"/>
+          <w:sz w:val="22"/>
+          <w:szCs w:val="22"/>
+        </w:rPr>
+        <w:t xml:space="preserve">The Capacitor mobile app (Android + iOS) adds native capabilities: camera proof-of-work, geolocation-based search, share sheet, offline awareness, local notifications, and a first-launch onboarding flow.</w:t>
+      </w:r>
+    </w:p>
+    <w:p>
+      <w:pPr>
+        <w:shd w:fill="E0F2FE" w:val="clear"/>
+        <w:spacing w:after="100" w:line="290"/>
+      </w:pPr>
+      <w:r>
+        <w:rPr>
+          <w:b/>
+          <w:bCs/>
+          <w:color w:val="0E7490"/>
+          <w:sz w:val="22"/>
+          <w:szCs w:val="22"/>
+        </w:rPr>
+        <w:t xml:space="preserve">Roles involved: </w:t>
+      </w:r>
+      <w:r>
+        <w:rPr>
+          <w:color w:val="0F172A"/>
+          <w:sz w:val="22"/>
+          <w:szCs w:val="22"/>
+        </w:rPr>
+      </w:r>
+    </w:p>
+    <w:p>
+      <w:pPr>
+        <w:pStyle w:val="Heading3"/>
+        <w:spacing w:before="200" w:after="80"/>
+      </w:pPr>
+      <w:r>
+        <w:rPr>
+          <w:b/>
+          <w:bCs/>
+          <w:color w:val="0F172A"/>
+          <w:sz w:val="24"/>
+          <w:szCs w:val="24"/>
+        </w:rPr>
+        <w:t xml:space="preserve">Functionality</w:t>
+      </w:r>
+    </w:p>
+    <w:p>
+      <w:pPr>
+        <w:pStyle w:val="ListParagraph"/>
+        <w:numPr>
+          <w:ilvl w:val="0"/>
+          <w:numId w:val="1"/>
+        </w:numPr>
+        <w:spacing w:after="60" w:line="290"/>
+      </w:pPr>
+      <w:r>
+        <w:rPr>
+          <w:color w:val="0F172A"/>
+          <w:sz w:val="22"/>
+          <w:szCs w:val="22"/>
+        </w:rPr>
+        <w:t xml:space="preserve">Camera proof-of-work: workers photograph completed jobs with before/after photos, with client-side resize/compression.</w:t>
+      </w:r>
+    </w:p>
+    <w:p>
+      <w:pPr>
+        <w:pStyle w:val="ListParagraph"/>
+        <w:numPr>
+          <w:ilvl w:val="0"/>
+          <w:numId w:val="1"/>
+        </w:numPr>
+        <w:spacing w:after="60" w:line="290"/>
+      </w:pPr>
+      <w:r>
+        <w:rPr>
+          <w:color w:val="0F172A"/>
+          <w:sz w:val="22"/>
+          <w:szCs w:val="22"/>
+        </w:rPr>
+        <w:t xml:space="preserve">Geolocation search: auto-detect user's city and sort by distance; workers can share their profile or completed jobs to social media.</w:t>
+      </w:r>
+    </w:p>
+    <w:p>
+      <w:pPr>
+        <w:pStyle w:val="ListParagraph"/>
+        <w:numPr>
+          <w:ilvl w:val="0"/>
+          <w:numId w:val="1"/>
+        </w:numPr>
+        <w:spacing w:after="60" w:line="290"/>
+      </w:pPr>
+      <w:r>
+        <w:rPr>
+          <w:color w:val="0F172A"/>
+          <w:sz w:val="22"/>
+          <w:szCs w:val="22"/>
+        </w:rPr>
+        <w:t xml:space="preserve">Offline banner: shows when connectivity drops, auto-dismisses when reconnected.</w:t>
+      </w:r>
+    </w:p>
+    <w:p>
+      <w:pPr>
+        <w:pStyle w:val="ListParagraph"/>
+        <w:numPr>
+          <w:ilvl w:val="0"/>
+          <w:numId w:val="1"/>
+        </w:numPr>
+        <w:spacing w:after="60" w:line="290"/>
+      </w:pPr>
+      <w:r>
+        <w:rPr>
+          <w:color w:val="0F172A"/>
+          <w:sz w:val="22"/>
+          <w:szCs w:val="22"/>
+        </w:rPr>
+        <w:t xml:space="preserve">Local notifications: schedules 30-minute-before reminders for upcoming bookings.</w:t>
+      </w:r>
+    </w:p>
+    <w:p>
+      <w:pPr>
+        <w:pStyle w:val="ListParagraph"/>
+        <w:numPr>
+          <w:ilvl w:val="0"/>
+          <w:numId w:val="1"/>
+        </w:numPr>
+        <w:spacing w:after="60" w:line="290"/>
+      </w:pPr>
+      <w:r>
+        <w:rPr>
+          <w:color w:val="0F172A"/>
+          <w:sz w:val="22"/>
+          <w:szCs w:val="22"/>
+        </w:rPr>
+        <w:t xml:space="preserve">Mobile onboarding: 4-step slide-through (name, trade, city, phone) that creates a worker profile + 30-day trial.</w:t>
+      </w:r>
+    </w:p>
+    <w:p>
+      <w:pPr>
+        <w:pStyle w:val="ListParagraph"/>
+        <w:numPr>
+          <w:ilvl w:val="0"/>
+          <w:numId w:val="1"/>
+        </w:numPr>
+        <w:spacing w:after="60" w:line="290"/>
+      </w:pPr>
+      <w:r>
+        <w:rPr>
+          <w:color w:val="0F172A"/>
+          <w:sz w:val="22"/>
+          <w:szCs w:val="22"/>
+        </w:rPr>
+        <w:t xml:space="preserve">Push notifications: all 12 booking state transitions send push notifications to the relevant party.</w:t>
+      </w:r>
+    </w:p>
+    <w:p>
+      <w:pPr>
+        <w:pStyle w:val="Heading3"/>
+        <w:spacing w:before="200" w:after="80"/>
+      </w:pPr>
+      <w:r>
+        <w:rPr>
+          <w:b/>
+          <w:bCs/>
+          <w:color w:val="0F172A"/>
+          <w:sz w:val="24"/>
+          <w:szCs w:val="24"/>
+        </w:rPr>
+        <w:t xml:space="preserve">Step by step — camera proof-of-work</w:t>
+      </w:r>
+    </w:p>
+    <w:p>
+      <w:pPr>
+        <w:spacing w:after="70" w:line="290"/>
+        <w:ind w:left="260" w:hanging="260"/>
+      </w:pPr>
+      <w:r>
+        <w:rPr>
+          <w:b/>
+          <w:bCs/>
+          <w:color w:val="0E7490"/>
+          <w:sz w:val="22"/>
+          <w:szCs w:val="22"/>
+        </w:rPr>
+        <w:t xml:space="preserve">1. </w:t>
+      </w:r>
+      <w:r>
+        <w:rPr>
+          <w:color w:val="0F172A"/>
+          <w:sz w:val="22"/>
+          <w:szCs w:val="22"/>
+        </w:rPr>
+        <w:t xml:space="preserve">When completing a booking, the worker sees the Proof Photo Capture component.</w:t>
+      </w:r>
+    </w:p>
+    <w:p>
+      <w:pPr>
+        <w:spacing w:after="70" w:line="290"/>
+        <w:ind w:left="260" w:hanging="260"/>
+      </w:pPr>
+      <w:r>
+        <w:rPr>
+          <w:b/>
+          <w:bCs/>
+          <w:color w:val="0E7490"/>
+          <w:sz w:val="22"/>
+          <w:szCs w:val="22"/>
+        </w:rPr>
+        <w:t xml:space="preserve">2. </w:t>
+      </w:r>
+      <w:r>
+        <w:rPr>
+          <w:color w:val="0F172A"/>
+          <w:sz w:val="22"/>
+          <w:szCs w:val="22"/>
+        </w:rPr>
+        <w:t xml:space="preserve">Tap to take 1–3 photos of the completed work (camera or gallery picker).</w:t>
+      </w:r>
+    </w:p>
+    <w:p>
+      <w:pPr>
+        <w:spacing w:after="70" w:line="290"/>
+        <w:ind w:left="260" w:hanging="260"/>
+      </w:pPr>
+      <w:r>
+        <w:rPr>
+          <w:b/>
+          <w:bCs/>
+          <w:color w:val="0E7490"/>
+          <w:sz w:val="22"/>
+          <w:szCs w:val="22"/>
+        </w:rPr>
+        <w:t xml:space="preserve">3. </w:t>
+      </w:r>
+      <w:r>
+        <w:rPr>
+          <w:color w:val="0F172A"/>
+          <w:sz w:val="22"/>
+          <w:szCs w:val="22"/>
+        </w:rPr>
+        <w:t xml:space="preserve">Preview the photos and submit — they're attached to the booking for the customer to see.</w:t>
+      </w:r>
+    </w:p>
+    <w:p>
+      <w:pPr>
+        <w:pStyle w:val="Heading3"/>
+        <w:spacing w:before="200" w:after="80"/>
+      </w:pPr>
+      <w:r>
+        <w:rPr>
+          <w:b/>
+          <w:bCs/>
+          <w:color w:val="0F172A"/>
+          <w:sz w:val="24"/>
+          <w:szCs w:val="24"/>
+        </w:rPr>
+        <w:t xml:space="preserve">Step by step — share sheet</w:t>
+      </w:r>
+    </w:p>
+    <w:p>
+      <w:pPr>
+        <w:spacing w:after="70" w:line="290"/>
+        <w:ind w:left="260" w:hanging="260"/>
+      </w:pPr>
+      <w:r>
+        <w:rPr>
+          <w:b/>
+          <w:bCs/>
+          <w:color w:val="0E7490"/>
+          <w:sz w:val="22"/>
+          <w:szCs w:val="22"/>
+        </w:rPr>
+        <w:t xml:space="preserve">1. </w:t>
+      </w:r>
+      <w:r>
+        <w:rPr>
+          <w:color w:val="0F172A"/>
+          <w:sz w:val="22"/>
+          <w:szCs w:val="22"/>
+        </w:rPr>
+        <w:t xml:space="preserve">On any worker profile or completed job, tap the Share button.</w:t>
+      </w:r>
+    </w:p>
+    <w:p>
+      <w:pPr>
+        <w:spacing w:after="70" w:line="290"/>
+        <w:ind w:left="260" w:hanging="260"/>
+      </w:pPr>
+      <w:r>
+        <w:rPr>
+          <w:b/>
+          <w:bCs/>
+          <w:color w:val="0E7490"/>
+          <w:sz w:val="22"/>
+          <w:szCs w:val="22"/>
+        </w:rPr>
+        <w:t xml:space="preserve">2. </w:t>
+      </w:r>
+      <w:r>
+        <w:rPr>
+          <w:color w:val="0F172A"/>
+          <w:sz w:val="22"/>
+          <w:szCs w:val="22"/>
+        </w:rPr>
+        <w:t xml:space="preserve">Choose to share via native share sheet (Instagram, WhatsApp, etc.) or copy the link.</w:t>
+      </w:r>
+    </w:p>
+    <w:p>
+      <w:pPr>
+        <w:pStyle w:val="Heading2"/>
+        <w:spacing w:before="260" w:after="100"/>
+      </w:pPr>
+      <w:r>
+        <w:rPr>
+          <w:b/>
+          <w:bCs/>
+          <w:color w:val="0E7490"/>
+          <w:sz w:val="28"/>
+          <w:szCs w:val="28"/>
+        </w:rPr>
+        <w:t xml:space="preserve">3.23 Referral program</w:t>
+      </w:r>
+    </w:p>
+    <w:p>
+      <w:pPr>
+        <w:spacing w:after="120" w:line="300"/>
+      </w:pPr>
+      <w:r>
+        <w:rPr>
+          <w:color w:val="0F172A"/>
+          <w:sz w:val="22"/>
+          <w:szCs w:val="22"/>
+        </w:rPr>
+        <w:t xml:space="preserve">Workers earn platform credits by inviting other workers to join the platform. Both the referrer and the invitee receive bonus credits.</w:t>
+      </w:r>
+    </w:p>
+    <w:p>
+      <w:pPr>
+        <w:shd w:fill="E0F2FE" w:val="clear"/>
+        <w:spacing w:after="100" w:line="290"/>
+      </w:pPr>
+      <w:r>
+        <w:rPr>
+          <w:b/>
+          <w:bCs/>
+          <w:color w:val="0E7490"/>
+          <w:sz w:val="22"/>
+          <w:szCs w:val="22"/>
+        </w:rPr>
+        <w:t xml:space="preserve">Roles involved: </w:t>
+      </w:r>
+      <w:r>
+        <w:rPr>
+          <w:color w:val="0F172A"/>
+          <w:sz w:val="22"/>
+          <w:szCs w:val="22"/>
+        </w:rPr>
+      </w:r>
+    </w:p>
+    <w:p>
+      <w:pPr>
+        <w:pStyle w:val="Heading3"/>
+        <w:spacing w:before="200" w:after="80"/>
+      </w:pPr>
+      <w:r>
+        <w:rPr>
+          <w:b/>
+          <w:bCs/>
+          <w:color w:val="0F172A"/>
+          <w:sz w:val="24"/>
+          <w:szCs w:val="24"/>
+        </w:rPr>
+        <w:t xml:space="preserve">Functionality</w:t>
+      </w:r>
+    </w:p>
+    <w:p>
+      <w:pPr>
+        <w:pStyle w:val="ListParagraph"/>
+        <w:numPr>
+          <w:ilvl w:val="0"/>
+          <w:numId w:val="1"/>
+        </w:numPr>
+        <w:spacing w:after="60" w:line="290"/>
+      </w:pPr>
+      <w:r>
+        <w:rPr>
+          <w:color w:val="0F172A"/>
+          <w:sz w:val="22"/>
+          <w:szCs w:val="22"/>
+        </w:rPr>
+        <w:t xml:space="preserve">Unique referral code per worker, shareable via link or code.</w:t>
+      </w:r>
+    </w:p>
+    <w:p>
+      <w:pPr>
+        <w:pStyle w:val="ListParagraph"/>
+        <w:numPr>
+          <w:ilvl w:val="0"/>
+          <w:numId w:val="1"/>
+        </w:numPr>
+        <w:spacing w:after="60" w:line="290"/>
+      </w:pPr>
+      <w:r>
+        <w:rPr>
+          <w:color w:val="0F172A"/>
+          <w:sz w:val="22"/>
+          <w:szCs w:val="22"/>
+        </w:rPr>
+        <w:t xml:space="preserve">Referrer earns 25 credits when the invitee completes their first booking (qualifying action).</w:t>
+      </w:r>
+    </w:p>
+    <w:p>
+      <w:pPr>
+        <w:pStyle w:val="ListParagraph"/>
+        <w:numPr>
+          <w:ilvl w:val="0"/>
+          <w:numId w:val="1"/>
+        </w:numPr>
+        <w:spacing w:after="60" w:line="290"/>
+      </w:pPr>
+      <w:r>
+        <w:rPr>
+          <w:color w:val="0F172A"/>
+          <w:sz w:val="22"/>
+          <w:szCs w:val="22"/>
+        </w:rPr>
+        <w:t xml:space="preserve">Invitee receives 10 credits on signup.</w:t>
+      </w:r>
+    </w:p>
+    <w:p>
+      <w:pPr>
+        <w:pStyle w:val="ListParagraph"/>
+        <w:numPr>
+          <w:ilvl w:val="0"/>
+          <w:numId w:val="1"/>
+        </w:numPr>
+        <w:spacing w:after="60" w:line="290"/>
+      </w:pPr>
+      <w:r>
+        <w:rPr>
+          <w:color w:val="0F172A"/>
+          <w:sz w:val="22"/>
+          <w:szCs w:val="22"/>
+        </w:rPr>
+        <w:t xml:space="preserve">Monthly cap: 10 referrals per worker. Lifetime cap: unlimited.</w:t>
+      </w:r>
+    </w:p>
+    <w:p>
+      <w:pPr>
+        <w:pStyle w:val="ListParagraph"/>
+        <w:numPr>
+          <w:ilvl w:val="0"/>
+          <w:numId w:val="1"/>
+        </w:numPr>
+        <w:spacing w:after="60" w:line="290"/>
+      </w:pPr>
+      <w:r>
+        <w:rPr>
+          <w:color w:val="0F172A"/>
+          <w:sz w:val="22"/>
+          <w:szCs w:val="22"/>
+        </w:rPr>
+        <w:t xml:space="preserve">Configurable by admin via FeeRuleSet.referral (referrerBonus, inviteeBonus, monthlyCap, lifetimeCap).</w:t>
+      </w:r>
+    </w:p>
+    <w:p>
+      <w:pPr>
+        <w:pStyle w:val="Heading3"/>
+        <w:spacing w:before="200" w:after="80"/>
+      </w:pPr>
+      <w:r>
+        <w:rPr>
+          <w:b/>
+          <w:bCs/>
+          <w:color w:val="0F172A"/>
+          <w:sz w:val="24"/>
+          <w:szCs w:val="24"/>
+        </w:rPr>
+        <w:t xml:space="preserve">Step by step</w:t>
+      </w:r>
+    </w:p>
+    <w:p>
+      <w:pPr>
+        <w:spacing w:after="70" w:line="290"/>
+        <w:ind w:left="260" w:hanging="260"/>
+      </w:pPr>
+      <w:r>
+        <w:rPr>
+          <w:b/>
+          <w:bCs/>
+          <w:color w:val="0E7490"/>
+          <w:sz w:val="22"/>
+          <w:szCs w:val="22"/>
+        </w:rPr>
+        <w:t xml:space="preserve">1. </w:t>
+      </w:r>
+      <w:r>
+        <w:rPr>
+          <w:color w:val="0F172A"/>
+          <w:sz w:val="22"/>
+          <w:szCs w:val="22"/>
+        </w:rPr>
+        <w:t xml:space="preserve">Open the dashboard and click the Referrals card.</w:t>
+      </w:r>
+    </w:p>
+    <w:p>
+      <w:pPr>
+        <w:spacing w:after="70" w:line="290"/>
+        <w:ind w:left="260" w:hanging="260"/>
+      </w:pPr>
+      <w:r>
+        <w:rPr>
+          <w:b/>
+          <w:bCs/>
+          <w:color w:val="0E7490"/>
+          <w:sz w:val="22"/>
+          <w:szCs w:val="22"/>
+        </w:rPr>
+        <w:t xml:space="preserve">2. </w:t>
+      </w:r>
+      <w:r>
+        <w:rPr>
+          <w:color w:val="0F172A"/>
+          <w:sz w:val="22"/>
+          <w:szCs w:val="22"/>
+        </w:rPr>
+        <w:t xml:space="preserve">Copy your unique referral code or share the referral link.</w:t>
+      </w:r>
+    </w:p>
+    <w:p>
+      <w:pPr>
+        <w:spacing w:after="70" w:line="290"/>
+        <w:ind w:left="260" w:hanging="260"/>
+      </w:pPr>
+      <w:r>
+        <w:rPr>
+          <w:b/>
+          <w:bCs/>
+          <w:color w:val="0E7490"/>
+          <w:sz w:val="22"/>
+          <w:szCs w:val="22"/>
+        </w:rPr>
+        <w:t xml:space="preserve">3. </w:t>
+      </w:r>
+      <w:r>
+        <w:rPr>
+          <w:color w:val="0F172A"/>
+          <w:sz w:val="22"/>
+          <w:szCs w:val="22"/>
+        </w:rPr>
+        <w:t xml:space="preserve">When someone signs up using your code and completes their first booking, both of you receive credits.</w:t>
+      </w:r>
+    </w:p>
+    <w:p>
+      <w:pPr>
+        <w:spacing w:after="70" w:line="290"/>
+        <w:ind w:left="260" w:hanging="260"/>
+      </w:pPr>
+      <w:r>
+        <w:rPr>
+          <w:b/>
+          <w:bCs/>
+          <w:color w:val="0E7490"/>
+          <w:sz w:val="22"/>
+          <w:szCs w:val="22"/>
+        </w:rPr>
+        <w:t xml:space="preserve">4. </w:t>
+      </w:r>
+      <w:r>
+        <w:rPr>
+          <w:color w:val="0F172A"/>
+          <w:sz w:val="22"/>
+          <w:szCs w:val="22"/>
+        </w:rPr>
+        <w:t xml:space="preserve">Track your referrals and earnings in the Referrals card overview.</w:t>
       </w:r>
     </w:p>
     <w:p>
@@ -7421,43 +8991,43 @@
           <w:sz w:val="22"/>
           <w:szCs w:val="22"/>
         </w:rPr>
-        <w:t xml:space="preserve">Rate: 7.0% (700 bps), floor $5, cap $300 per job.</w:t>
-      </w:r>
-    </w:p>
-    <w:p>
-      <w:pPr>
-        <w:pStyle w:val="ListParagraph"/>
-        <w:numPr>
-          <w:ilvl w:val="0"/>
-          <w:numId w:val="1"/>
-        </w:numPr>
-        <w:spacing w:after="60" w:line="290"/>
-      </w:pPr>
-      <w:r>
-        <w:rPr>
-          <w:color w:val="0F172A"/>
-          <w:sz w:val="22"/>
-          <w:szCs w:val="22"/>
-        </w:rPr>
-        <w:t xml:space="preserve">Stamped once at accept-with-quote as an immutable snapshot on the booking; Enterprise is exempt (fee 0).</w:t>
-      </w:r>
-    </w:p>
-    <w:p>
-      <w:pPr>
-        <w:pStyle w:val="ListParagraph"/>
-        <w:numPr>
-          <w:ilvl w:val="0"/>
-          <w:numId w:val="1"/>
-        </w:numPr>
-        <w:spacing w:after="60" w:line="290"/>
-      </w:pPr>
-      <w:r>
-        <w:rPr>
-          <w:color w:val="0F172A"/>
-          <w:sz w:val="22"/>
-          <w:szCs w:val="22"/>
-        </w:rPr>
-        <w:t xml:space="preserve">Settlement: worker earnings = quote − platform fee, credited to the ledger at COMPLETED, withdrawn through the admin-reviewed payout queue.</w:t>
+        <w:t xml:space="preserve">Tiered rates: Free 12%, Starter 9%, Growth 7%, Pro 5%, Business 4% (or exempt). Floor $5, cap $300 per job.</w:t>
+      </w:r>
+    </w:p>
+    <w:p>
+      <w:pPr>
+        <w:pStyle w:val="ListParagraph"/>
+        <w:numPr>
+          <w:ilvl w:val="0"/>
+          <w:numId w:val="1"/>
+        </w:numPr>
+        <w:spacing w:after="60" w:line="290"/>
+      </w:pPr>
+      <w:r>
+        <w:rPr>
+          <w:color w:val="0F172A"/>
+          <w:sz w:val="22"/>
+          <w:szCs w:val="22"/>
+        </w:rPr>
+        <w:t xml:space="preserve">Stamped once at accept-with-quote as an immutable snapshot on the booking; Business plans can be set fully exempt. Admin can set per-category and per-promotion overrides.</w:t>
+      </w:r>
+    </w:p>
+    <w:p>
+      <w:pPr>
+        <w:pStyle w:val="ListParagraph"/>
+        <w:numPr>
+          <w:ilvl w:val="0"/>
+          <w:numId w:val="1"/>
+        </w:numPr>
+        <w:spacing w:after="60" w:line="290"/>
+      </w:pPr>
+      <w:r>
+        <w:rPr>
+          <w:color w:val="0F172A"/>
+          <w:sz w:val="22"/>
+          <w:szCs w:val="22"/>
+        </w:rPr>
+        <w:t xml:space="preserve">Settlement: worker earnings = quote − platform fee + lead rebate (if applicable), credited to the ledger at COMPLETED, withdrawn through the admin-reviewed payout queue.</w:t>
       </w:r>
     </w:p>
     <w:p>
@@ -7598,6 +9168,128 @@
           <w:szCs w:val="22"/>
         </w:rPr>
         <w:t xml:space="preserve">No fee on deposits, no fee on quote requests / multi-candidate bidding, no charge for reviews, favorites, or leads.</w:t>
+      </w:r>
+    </w:p>
+    <w:p>
+      <w:pPr>
+        <w:pStyle w:val="Heading2"/>
+        <w:spacing w:before="260" w:after="100"/>
+      </w:pPr>
+      <w:r>
+        <w:rPr>
+          <w:b/>
+          <w:bCs/>
+          <w:color w:val="0E7490"/>
+          <w:sz w:val="28"/>
+          <w:szCs w:val="28"/>
+        </w:rPr>
+        <w:t xml:space="preserve">5.5 From lead marketplace (live)</w:t>
+      </w:r>
+    </w:p>
+    <w:p>
+      <w:pPr>
+        <w:pStyle w:val="ListParagraph"/>
+        <w:numPr>
+          <w:ilvl w:val="0"/>
+          <w:numId w:val="1"/>
+        </w:numPr>
+        <w:spacing w:after="60" w:line="290"/>
+      </w:pPr>
+      <w:r>
+        <w:rPr>
+          <w:color w:val="0F172A"/>
+          <w:sz w:val="22"/>
+          <w:szCs w:val="22"/>
+        </w:rPr>
+        <w:t xml:space="preserve">Lead grades and pricing: Bronze 5 credits ($5), Silver 9 credits ($9), Gold 20 credits ($20), Emergency 35 credits ($35).</w:t>
+      </w:r>
+    </w:p>
+    <w:p>
+      <w:pPr>
+        <w:pStyle w:val="ListParagraph"/>
+        <w:numPr>
+          <w:ilvl w:val="0"/>
+          <w:numId w:val="1"/>
+        </w:numPr>
+        <w:spacing w:after="60" w:line="290"/>
+      </w:pPr>
+      <w:r>
+        <w:rPr>
+          <w:color w:val="0F172A"/>
+          <w:sz w:val="22"/>
+          <w:szCs w:val="22"/>
+        </w:rPr>
+        <w:t xml:space="preserve">Workers buy credits via OMT/Whish ($25–$150 packages with bonus credits); credits are consumed when buying leads.</w:t>
+      </w:r>
+    </w:p>
+    <w:p>
+      <w:pPr>
+        <w:pStyle w:val="ListParagraph"/>
+        <w:numPr>
+          <w:ilvl w:val="0"/>
+          <w:numId w:val="1"/>
+        </w:numPr>
+        <w:spacing w:after="60" w:line="290"/>
+      </w:pPr>
+      <w:r>
+        <w:rPr>
+          <w:color w:val="0F172A"/>
+          <w:sz w:val="22"/>
+          <w:szCs w:val="22"/>
+        </w:rPr>
+        <w:t xml:space="preserve">Lead rebate: when a bought lead converts to a completed job, the lead's cost is rebated against the platform fee — so buying leads lowers the effective take rate on the work they win.</w:t>
+      </w:r>
+    </w:p>
+    <w:p>
+      <w:pPr>
+        <w:pStyle w:val="ListParagraph"/>
+        <w:numPr>
+          <w:ilvl w:val="0"/>
+          <w:numId w:val="1"/>
+        </w:numPr>
+        <w:spacing w:after="60" w:line="290"/>
+      </w:pPr>
+      <w:r>
+        <w:rPr>
+          <w:color w:val="0F172A"/>
+          <w:sz w:val="22"/>
+          <w:szCs w:val="22"/>
+        </w:rPr>
+        <w:t xml:space="preserve">Smart pricing: dynamic lead multipliers based on demand (rush hour +15%, weekend +10–20%, holidays +30–35%, seasonal +15–25%).</w:t>
+      </w:r>
+    </w:p>
+    <w:p>
+      <w:pPr>
+        <w:pStyle w:val="Heading2"/>
+        <w:spacing w:before="260" w:after="100"/>
+      </w:pPr>
+      <w:r>
+        <w:rPr>
+          <w:b/>
+          <w:bCs/>
+          <w:color w:val="0E7490"/>
+          <w:sz w:val="28"/>
+          <w:szCs w:val="28"/>
+        </w:rPr>
+        <w:t xml:space="preserve">5.6 From referrals (live)</w:t>
+      </w:r>
+    </w:p>
+    <w:p>
+      <w:pPr>
+        <w:pStyle w:val="ListParagraph"/>
+        <w:numPr>
+          <w:ilvl w:val="0"/>
+          <w:numId w:val="1"/>
+        </w:numPr>
+        <w:spacing w:after="60" w:line="290"/>
+      </w:pPr>
+      <w:r>
+        <w:rPr>
+          <w:color w:val="0F172A"/>
+          <w:sz w:val="22"/>
+          <w:szCs w:val="22"/>
+        </w:rPr>
+        <w:t xml:space="preserve">Referrer earns 25 credits per successful referral; invitee gets 10 credits on signup. Monthly cap: 10 referrals. Qualifying action: invitee completes first booking.</w:t>
       </w:r>
     </w:p>
     <w:p>

</xml_diff>